<commit_message>
CS1105 Unit 6: cite every claim (Cook 2015b UART example, RISC-V International), 741-word discussion
Co-Authored-By: Claude Opus 5.5 <noreply@anthropic.com>
</commit_message>
<xml_diff>
--- a/CS1105_Digital_Electronics_Architecture/Unit6_Computer_Architecture/Assignment/Unit6_Assignment_Activity.docx
+++ b/CS1105_Digital_Electronics_Architecture/Unit6_Computer_Architecture/Assignment/Unit6_Assignment_Activity.docx
@@ -148,7 +148,7 @@
           <w:i w:val="0"/>
           <w:sz w:val="24"/>
         </w:rPr>
-        <w:t>The Zilog Z80 is an 8-bit microprocessor introduced in 1976 that powered early personal computers and is still found in embedded systems. It is a good processor to study because it is simple enough to follow one clock cycle at a time, yet it has a complete interrupt system with three modes. This paper explains how the Z80 fetches, decodes, and executes instructions, how it responds to interrupts, and why interrupt handling is essential to its smooth operation. Every example program in this paper was run on a Z80 emulator, so the register values and addresses shown are the ones the processor actually produced.</w:t>
+        <w:t>The Zilog Z80 is an 8-bit microprocessor from the 1970s that powered early personal computers and is still found in embedded systems. It is a good processor to study because it is simple enough to follow one clock cycle at a time, yet it has a complete interrupt system with three modes. This paper explains how the Z80 fetches, decodes, and executes instructions, how it responds to interrupts, and why interrupt handling is essential to its smooth operation. Every example program in this paper was run on a Z80 emulator, so the register values and addresses shown are the ones the processor actually produced.</w:t>
       </w:r>
     </w:p>
     <w:p>
@@ -2429,7 +2429,7 @@
           <w:i w:val="0"/>
           <w:sz w:val="24"/>
         </w:rPr>
-        <w:t>Cook (2015) points out that most general peripherals cannot supply the bytes that Modes 0 and 2 need, so he recommends Mode 1 for simple home-built systems, where one routine at 0038h checks which device needs attention. Mode 2 is the most powerful, because each device can point directly to its own routine; Zilog's own peripheral chips are designed to supply the vector byte for it (Zilog, 2016, pp. 19-20).</w:t>
+        <w:t>Cook (2015a) points out that most general peripherals cannot supply the bytes that Modes 0 and 2 need, so he recommends Mode 1 for simple home-built systems, where one routine at 0038h checks which device needs attention. Mode 2 is the most powerful, because each device can point directly to its own routine; Zilog's own peripheral chips are designed to supply the vector byte for it (Zilog, 2016, pp. 19-20).</w:t>
       </w:r>
     </w:p>
     <w:p>
@@ -3175,7 +3175,7 @@
           <w:i w:val="0"/>
           <w:sz w:val="24"/>
         </w:rPr>
-        <w:t>: check every device again and again in a loop to see whether it needs attention. Polling wastes most of the processor's time, because devices are usually idle, and it can still miss an event that happens between two checks. Interrupts reverse the relationship: the CPU gets on with useful work, or halts to save power, and each device asks for attention only when something actually happens. This is why the example program can simply HALT until a key is pressed. Home computers built on the Z80, such as the ZX Spectrum, used a regular timer interrupt in Mode 1 to scan the keyboard and keep time while the main program ran.</w:t>
+        <w:t>: check every device again and again in a loop to see whether it needs attention. Polling wastes most of the processor's time, because devices are usually idle, and it can still miss an event that happens between two checks. Interrupts reverse the relationship: the CPU gets on with useful work, or halts to save power, and each device asks for attention only when something actually happens. This is why the example program can simply HALT until a key is pressed. Cook (2015b) shows the same benefit in a real Z80 project: he connected a UART (serial port chip) to the /INT pin and used Mode 1, so that a key pressed on the terminal interrupts the Z80, which then jumps to 0038h to read it. As he explains, this frees the system from polling so that it can dedicate its processing time to other tasks.</w:t>
       </w:r>
     </w:p>
     <w:p>
@@ -3633,7 +3633,7 @@
           <w:i w:val="0"/>
           <w:sz w:val="24"/>
         </w:rPr>
-        <w:t xml:space="preserve">Cook, M. (2015, April 15). </w:t>
+        <w:t xml:space="preserve">Cook, M. (2015a, April 15). </w:t>
       </w:r>
       <w:r>
         <w:rPr>
@@ -3677,6 +3677,50 @@
           <w:i w:val="0"/>
           <w:sz w:val="24"/>
         </w:rPr>
+        <w:t xml:space="preserve">Cook, M. (2015b, April 29). </w:t>
+      </w:r>
+      <w:r>
+        <w:rPr>
+          <w:rFonts w:ascii="Times New Roman" w:hAnsi="Times New Roman"/>
+          <w:b w:val="0"/>
+          <w:i/>
+          <w:sz w:val="24"/>
+        </w:rPr>
+        <w:t>Z80 interrupts and strings</w:t>
+      </w:r>
+      <w:r>
+        <w:rPr>
+          <w:rFonts w:ascii="Times New Roman" w:hAnsi="Times New Roman"/>
+          <w:b w:val="0"/>
+          <w:i w:val="0"/>
+          <w:sz w:val="24"/>
+        </w:rPr>
+        <w:t xml:space="preserve">. Z80 Computer Project. </w:t>
+      </w:r>
+      <w:hyperlink r:id="rId17">
+        <w:r>
+          <w:rPr>
+            <w:rFonts w:ascii="Times New Roman" w:hAnsi="Times New Roman"/>
+            <w:color w:val="0563C1"/>
+            <w:u w:val="single"/>
+            <w:sz w:val="24"/>
+          </w:rPr>
+          <w:t>https://z80project.wordpress.com/2015/04/29/z80-interrupts-and-strings/</w:t>
+        </w:r>
+      </w:hyperlink>
+    </w:p>
+    <w:p>
+      <w:pPr>
+        <w:spacing w:line="360" w:lineRule="auto" w:after="0"/>
+        <w:ind w:left="720" w:hanging="720"/>
+      </w:pPr>
+      <w:r>
+        <w:rPr>
+          <w:rFonts w:ascii="Times New Roman" w:hAnsi="Times New Roman"/>
+          <w:b w:val="0"/>
+          <w:i w:val="0"/>
+          <w:sz w:val="24"/>
+        </w:rPr>
         <w:t xml:space="preserve">Futurology. (2017, December 7). </w:t>
       </w:r>
       <w:r>
@@ -3697,7 +3741,7 @@
         </w:rPr>
         <w:t xml:space="preserve"> [Video]. YouTube. </w:t>
       </w:r>
-      <w:hyperlink r:id="rId17">
+      <w:hyperlink r:id="rId18">
         <w:r>
           <w:rPr>
             <w:rFonts w:ascii="Times New Roman" w:hAnsi="Times New Roman"/>
@@ -3741,7 +3785,7 @@
         </w:rPr>
         <w:t xml:space="preserve"> [Video]. YouTube. </w:t>
       </w:r>
-      <w:hyperlink r:id="rId18">
+      <w:hyperlink r:id="rId19">
         <w:r>
           <w:rPr>
             <w:rFonts w:ascii="Times New Roman" w:hAnsi="Times New Roman"/>
@@ -3785,7 +3829,7 @@
         </w:rPr>
         <w:t xml:space="preserve"> (UM008011-0816). </w:t>
       </w:r>
-      <w:hyperlink r:id="rId19">
+      <w:hyperlink r:id="rId20">
         <w:r>
           <w:rPr>
             <w:rFonts w:ascii="Times New Roman" w:hAnsi="Times New Roman"/>

</xml_diff>